<commit_message>
Agrego form conv pasantia ind y seccion alumnos
</commit_message>
<xml_diff>
--- a/storage/app/plantillas/Convenio_individual_pasantia.docx
+++ b/storage/app/plantillas/Convenio_individual_pasantia.docx
@@ -1,6 +1,6 @@
 
 <file path=word/document.xml><?xml version="1.0" encoding="utf-8"?>
-<w:document xmlns:wpc="http://schemas.microsoft.com/office/word/2010/wordprocessingCanvas" xmlns:cx="http://schemas.microsoft.com/office/drawing/2014/chartex" xmlns:mc="http://schemas.openxmlformats.org/markup-compatibility/2006" xmlns:o="urn:schemas-microsoft-com:office:office" xmlns:r="http://schemas.openxmlformats.org/officeDocument/2006/relationships" xmlns:m="http://schemas.openxmlformats.org/officeDocument/2006/math" xmlns:v="urn:schemas-microsoft-com:vml" xmlns:wp14="http://schemas.microsoft.com/office/word/2010/wordprocessingDrawing" xmlns:wp="http://schemas.openxmlformats.org/drawingml/2006/wordprocessingDrawing" xmlns:w10="urn:schemas-microsoft-com:office:word" xmlns:w="http://schemas.openxmlformats.org/wordprocessingml/2006/main" xmlns:w14="http://schemas.microsoft.com/office/word/2010/wordml" xmlns:w15="http://schemas.microsoft.com/office/word/2012/wordml" xmlns:w16se="http://schemas.microsoft.com/office/word/2015/wordml/symex" xmlns:wpg="http://schemas.microsoft.com/office/word/2010/wordprocessingGroup" xmlns:wpi="http://schemas.microsoft.com/office/word/2010/wordprocessingInk" xmlns:wne="http://schemas.microsoft.com/office/word/2006/wordml" xmlns:wps="http://schemas.microsoft.com/office/word/2010/wordprocessingShape" mc:Ignorable="w14 w15 w16se wp14">
+<w:document xmlns:wpc="http://schemas.microsoft.com/office/word/2010/wordprocessingCanvas" xmlns:cx="http://schemas.microsoft.com/office/drawing/2014/chartex" xmlns:cx1="http://schemas.microsoft.com/office/drawing/2015/9/8/chartex" xmlns:cx2="http://schemas.microsoft.com/office/drawing/2015/10/21/chartex" xmlns:cx3="http://schemas.microsoft.com/office/drawing/2016/5/9/chartex" xmlns:cx4="http://schemas.microsoft.com/office/drawing/2016/5/10/chartex" xmlns:cx5="http://schemas.microsoft.com/office/drawing/2016/5/11/chartex" xmlns:cx6="http://schemas.microsoft.com/office/drawing/2016/5/12/chartex" xmlns:cx7="http://schemas.microsoft.com/office/drawing/2016/5/13/chartex" xmlns:cx8="http://schemas.microsoft.com/office/drawing/2016/5/14/chartex" xmlns:mc="http://schemas.openxmlformats.org/markup-compatibility/2006" xmlns:aink="http://schemas.microsoft.com/office/drawing/2016/ink" xmlns:am3d="http://schemas.microsoft.com/office/drawing/2017/model3d" xmlns:o="urn:schemas-microsoft-com:office:office" xmlns:oel="http://schemas.microsoft.com/office/2019/extlst" xmlns:r="http://schemas.openxmlformats.org/officeDocument/2006/relationships" xmlns:m="http://schemas.openxmlformats.org/officeDocument/2006/math" xmlns:v="urn:schemas-microsoft-com:vml" xmlns:wp14="http://schemas.microsoft.com/office/word/2010/wordprocessingDrawing" xmlns:wp="http://schemas.openxmlformats.org/drawingml/2006/wordprocessingDrawing" xmlns:w10="urn:schemas-microsoft-com:office:word" xmlns:w="http://schemas.openxmlformats.org/wordprocessingml/2006/main" xmlns:w14="http://schemas.microsoft.com/office/word/2010/wordml" xmlns:w15="http://schemas.microsoft.com/office/word/2012/wordml" xmlns:w16cex="http://schemas.microsoft.com/office/word/2018/wordml/cex" xmlns:w16cid="http://schemas.microsoft.com/office/word/2016/wordml/cid" xmlns:w16="http://schemas.microsoft.com/office/word/2018/wordml" xmlns:w16du="http://schemas.microsoft.com/office/word/2023/wordml/word16du" xmlns:w16sdtdh="http://schemas.microsoft.com/office/word/2020/wordml/sdtdatahash" xmlns:w16sdtfl="http://schemas.microsoft.com/office/word/2024/wordml/sdtformatlock" xmlns:w16se="http://schemas.microsoft.com/office/word/2015/wordml/symex" xmlns:wpg="http://schemas.microsoft.com/office/word/2010/wordprocessingGroup" xmlns:wpi="http://schemas.microsoft.com/office/word/2010/wordprocessingInk" xmlns:wne="http://schemas.microsoft.com/office/word/2006/wordml" xmlns:wps="http://schemas.microsoft.com/office/word/2010/wordprocessingShape" mc:Ignorable="w14 w15 w16se w16cid w16 w16cex w16sdtdh w16sdtfl w16du wp14">
   <w:body>
     <w:p>
       <w:pPr>
@@ -102,7 +102,7 @@
           <w:sz w:val="20"/>
           <w:szCs w:val="20"/>
         </w:rPr>
-        <w:t>} Nº ${</w:t>
+        <w:t xml:space="preserve">} </w:t>
       </w:r>
       <w:proofErr w:type="spellStart"/>
       <w:r>
@@ -112,6 +112,26 @@
           <w:sz w:val="20"/>
           <w:szCs w:val="20"/>
         </w:rPr>
+        <w:t>Nº</w:t>
+      </w:r>
+      <w:proofErr w:type="spellEnd"/>
+      <w:r>
+        <w:rPr>
+          <w:rFonts w:ascii="Arial" w:eastAsia="Arial" w:hAnsi="Arial" w:cs="Arial"/>
+          <w:color w:val="000000"/>
+          <w:sz w:val="20"/>
+          <w:szCs w:val="20"/>
+        </w:rPr>
+        <w:t xml:space="preserve"> ${</w:t>
+      </w:r>
+      <w:proofErr w:type="spellStart"/>
+      <w:r>
+        <w:rPr>
+          <w:rFonts w:ascii="Arial" w:eastAsia="Arial" w:hAnsi="Arial" w:cs="Arial"/>
+          <w:color w:val="000000"/>
+          <w:sz w:val="20"/>
+          <w:szCs w:val="20"/>
+        </w:rPr>
         <w:t>numeroDomicilioEmpresa</w:t>
       </w:r>
       <w:proofErr w:type="spellEnd"/>
@@ -162,7 +182,7 @@
           <w:sz w:val="20"/>
           <w:szCs w:val="20"/>
         </w:rPr>
-        <w:t>} (CUIL Nº ${</w:t>
+        <w:t xml:space="preserve">} (CUIL </w:t>
       </w:r>
       <w:proofErr w:type="spellStart"/>
       <w:r>
@@ -172,6 +192,26 @@
           <w:sz w:val="20"/>
           <w:szCs w:val="20"/>
         </w:rPr>
+        <w:t>Nº</w:t>
+      </w:r>
+      <w:proofErr w:type="spellEnd"/>
+      <w:r>
+        <w:rPr>
+          <w:rFonts w:ascii="Arial" w:eastAsia="Arial" w:hAnsi="Arial" w:cs="Arial"/>
+          <w:color w:val="000000"/>
+          <w:sz w:val="20"/>
+          <w:szCs w:val="20"/>
+        </w:rPr>
+        <w:t xml:space="preserve"> ${</w:t>
+      </w:r>
+      <w:proofErr w:type="spellStart"/>
+      <w:r>
+        <w:rPr>
+          <w:rFonts w:ascii="Arial" w:eastAsia="Arial" w:hAnsi="Arial" w:cs="Arial"/>
+          <w:color w:val="000000"/>
+          <w:sz w:val="20"/>
+          <w:szCs w:val="20"/>
+        </w:rPr>
         <w:t>cuitRepresentante</w:t>
       </w:r>
       <w:proofErr w:type="spellEnd"/>
@@ -202,7 +242,7 @@
           <w:sz w:val="20"/>
           <w:szCs w:val="20"/>
         </w:rPr>
-        <w:t>} (CUIL Nº ${</w:t>
+        <w:t xml:space="preserve">} (CUIL </w:t>
       </w:r>
       <w:proofErr w:type="spellStart"/>
       <w:r>
@@ -212,6 +252,26 @@
           <w:sz w:val="20"/>
           <w:szCs w:val="20"/>
         </w:rPr>
+        <w:t>Nº</w:t>
+      </w:r>
+      <w:proofErr w:type="spellEnd"/>
+      <w:r>
+        <w:rPr>
+          <w:rFonts w:ascii="Arial" w:eastAsia="Arial" w:hAnsi="Arial" w:cs="Arial"/>
+          <w:color w:val="000000"/>
+          <w:sz w:val="20"/>
+          <w:szCs w:val="20"/>
+        </w:rPr>
+        <w:t xml:space="preserve"> ${</w:t>
+      </w:r>
+      <w:proofErr w:type="spellStart"/>
+      <w:r>
+        <w:rPr>
+          <w:rFonts w:ascii="Arial" w:eastAsia="Arial" w:hAnsi="Arial" w:cs="Arial"/>
+          <w:color w:val="000000"/>
+          <w:sz w:val="20"/>
+          <w:szCs w:val="20"/>
+        </w:rPr>
         <w:t>cuilPasante</w:t>
       </w:r>
       <w:proofErr w:type="spellEnd"/>
@@ -242,7 +302,7 @@
           <w:sz w:val="20"/>
           <w:szCs w:val="20"/>
         </w:rPr>
-        <w:t>} Nº ${</w:t>
+        <w:t xml:space="preserve">} </w:t>
       </w:r>
       <w:proofErr w:type="spellStart"/>
       <w:r>
@@ -252,6 +312,26 @@
           <w:sz w:val="20"/>
           <w:szCs w:val="20"/>
         </w:rPr>
+        <w:t>Nº</w:t>
+      </w:r>
+      <w:proofErr w:type="spellEnd"/>
+      <w:r>
+        <w:rPr>
+          <w:rFonts w:ascii="Arial" w:eastAsia="Arial" w:hAnsi="Arial" w:cs="Arial"/>
+          <w:color w:val="000000"/>
+          <w:sz w:val="20"/>
+          <w:szCs w:val="20"/>
+        </w:rPr>
+        <w:t xml:space="preserve"> ${</w:t>
+      </w:r>
+      <w:proofErr w:type="spellStart"/>
+      <w:r>
+        <w:rPr>
+          <w:rFonts w:ascii="Arial" w:eastAsia="Arial" w:hAnsi="Arial" w:cs="Arial"/>
+          <w:color w:val="000000"/>
+          <w:sz w:val="20"/>
+          <w:szCs w:val="20"/>
+        </w:rPr>
         <w:t>numeroDomicilioPasante</w:t>
       </w:r>
       <w:proofErr w:type="spellEnd"/>
@@ -320,15 +400,6 @@
       <w:r>
         <w:rPr>
           <w:rFonts w:ascii="Arial" w:eastAsia="Arial" w:hAnsi="Arial" w:cs="Arial"/>
-          <w:color w:val="000000"/>
-          <w:sz w:val="20"/>
-          <w:szCs w:val="20"/>
-        </w:rPr>
-        <w:t>_</w:t>
-      </w:r>
-      <w:r>
-        <w:rPr>
-          <w:rFonts w:ascii="Arial" w:eastAsia="Arial" w:hAnsi="Arial" w:cs="Arial"/>
           <w:sz w:val="20"/>
           <w:szCs w:val="20"/>
         </w:rPr>
@@ -350,16 +421,16 @@
           <w:sz w:val="20"/>
           <w:szCs w:val="20"/>
         </w:rPr>
-        <w:t xml:space="preserve">} </w:t>
-      </w:r>
-      <w:r>
-        <w:rPr>
-          <w:rFonts w:ascii="Arial" w:eastAsia="Arial" w:hAnsi="Arial" w:cs="Arial"/>
-          <w:color w:val="000000"/>
-          <w:sz w:val="20"/>
-          <w:szCs w:val="20"/>
-        </w:rPr>
-        <w:t xml:space="preserve">_ entre “la Empresa” y “la Universidad”, y en virtud del cual un alumno de dicha casa de estudios realiza pasantías en la mencionada empresa. Ambas partes declaran conocer perfectamente los términos del referido Convenio el que se comprometen a cumplir íntegramente, cuya copia fiel constituye el Anexo I que como tal integra este </w:t>
+        <w:t>}</w:t>
+      </w:r>
+      <w:r>
+        <w:rPr>
+          <w:rFonts w:ascii="Arial" w:eastAsia="Arial" w:hAnsi="Arial" w:cs="Arial"/>
+          <w:color w:val="000000"/>
+          <w:sz w:val="20"/>
+          <w:szCs w:val="20"/>
+        </w:rPr>
+        <w:t xml:space="preserve"> entre “la Empresa” y “la Universidad”, y en virtud del cual un alumno de dicha casa de estudios realiza pasantías en la mencionada empresa. Ambas partes declaran conocer perfectamente los términos del referido Convenio el que se comprometen a cumplir íntegramente, cuya copia fiel constituye el Anexo I que como tal integra este </w:t>
       </w:r>
       <w:proofErr w:type="gramStart"/>
       <w:r>
@@ -583,18 +654,7 @@
           <w:sz w:val="20"/>
           <w:szCs w:val="20"/>
         </w:rPr>
-        <w:t>fe</w:t>
-      </w:r>
-      <w:bookmarkStart w:id="0" w:name="_GoBack"/>
-      <w:bookmarkEnd w:id="0"/>
-      <w:r>
-        <w:rPr>
-          <w:rFonts w:ascii="Arial" w:eastAsia="Arial" w:hAnsi="Arial" w:cs="Arial"/>
-          <w:color w:val="000000"/>
-          <w:sz w:val="20"/>
-          <w:szCs w:val="20"/>
-        </w:rPr>
-        <w:t>chaInicioPasantia</w:t>
+        <w:t>fechaInicioPasantia</w:t>
       </w:r>
       <w:proofErr w:type="spellEnd"/>
       <w:r>
@@ -703,7 +763,7 @@
           <w:szCs w:val="20"/>
           <w:lang w:val="es-AR"/>
         </w:rPr>
-        <w:t>}, CUIL Nº: ${</w:t>
+        <w:t xml:space="preserve">}, CUIL </w:t>
       </w:r>
       <w:proofErr w:type="spellStart"/>
       <w:r>
@@ -714,6 +774,28 @@
           <w:szCs w:val="20"/>
           <w:lang w:val="es-AR"/>
         </w:rPr>
+        <w:t>Nº</w:t>
+      </w:r>
+      <w:proofErr w:type="spellEnd"/>
+      <w:r>
+        <w:rPr>
+          <w:rFonts w:ascii="Arial" w:eastAsia="Arial" w:hAnsi="Arial" w:cs="Arial"/>
+          <w:color w:val="000000"/>
+          <w:sz w:val="20"/>
+          <w:szCs w:val="20"/>
+          <w:lang w:val="es-AR"/>
+        </w:rPr>
+        <w:t>: ${</w:t>
+      </w:r>
+      <w:proofErr w:type="spellStart"/>
+      <w:r>
+        <w:rPr>
+          <w:rFonts w:ascii="Arial" w:eastAsia="Arial" w:hAnsi="Arial" w:cs="Arial"/>
+          <w:color w:val="000000"/>
+          <w:sz w:val="20"/>
+          <w:szCs w:val="20"/>
+          <w:lang w:val="es-AR"/>
+        </w:rPr>
         <w:t>cuilTutor</w:t>
       </w:r>
       <w:proofErr w:type="spellEnd"/>
@@ -747,7 +829,29 @@
           <w:szCs w:val="20"/>
           <w:lang w:val="es-AR"/>
         </w:rPr>
-        <w:t>}, CUIL Nº: ${</w:t>
+        <w:t xml:space="preserve">}, CUIL </w:t>
+      </w:r>
+      <w:proofErr w:type="spellStart"/>
+      <w:r>
+        <w:rPr>
+          <w:rFonts w:ascii="Arial" w:eastAsia="Arial" w:hAnsi="Arial" w:cs="Arial"/>
+          <w:color w:val="000000"/>
+          <w:sz w:val="20"/>
+          <w:szCs w:val="20"/>
+          <w:lang w:val="es-AR"/>
+        </w:rPr>
+        <w:t>Nº</w:t>
+      </w:r>
+      <w:proofErr w:type="spellEnd"/>
+      <w:r>
+        <w:rPr>
+          <w:rFonts w:ascii="Arial" w:eastAsia="Arial" w:hAnsi="Arial" w:cs="Arial"/>
+          <w:color w:val="000000"/>
+          <w:sz w:val="20"/>
+          <w:szCs w:val="20"/>
+          <w:lang w:val="es-AR"/>
+        </w:rPr>
+        <w:t>: ${</w:t>
       </w:r>
       <w:proofErr w:type="spellStart"/>
       <w:r>
@@ -1172,7 +1276,7 @@
           <w:sz w:val="20"/>
           <w:szCs w:val="20"/>
         </w:rPr>
-        <w:t xml:space="preserve">que trabaje el pasante será considerada confidencial con autorización del tutor laboral podrá hacer uso de la misma para finalidades </w:t>
+        <w:t xml:space="preserve">que trabaje el pasante será considerada confidencial con autorización del tutor laboral podrá hacer uso de </w:t>
       </w:r>
       <w:proofErr w:type="gramStart"/>
       <w:r>
@@ -1181,6 +1285,24 @@
           <w:sz w:val="20"/>
           <w:szCs w:val="20"/>
         </w:rPr>
+        <w:t>la misma</w:t>
+      </w:r>
+      <w:proofErr w:type="gramEnd"/>
+      <w:r>
+        <w:rPr>
+          <w:rFonts w:ascii="Arial" w:eastAsia="Arial" w:hAnsi="Arial" w:cs="Arial"/>
+          <w:sz w:val="20"/>
+          <w:szCs w:val="20"/>
+        </w:rPr>
+        <w:t xml:space="preserve"> para finalidades </w:t>
+      </w:r>
+      <w:proofErr w:type="gramStart"/>
+      <w:r>
+        <w:rPr>
+          <w:rFonts w:ascii="Arial" w:eastAsia="Arial" w:hAnsi="Arial" w:cs="Arial"/>
+          <w:sz w:val="20"/>
+          <w:szCs w:val="20"/>
+        </w:rPr>
         <w:t>académicas.-</w:t>
       </w:r>
       <w:proofErr w:type="gramEnd"/>
@@ -1312,39 +1434,28 @@
           <w:sz w:val="20"/>
           <w:szCs w:val="20"/>
         </w:rPr>
-        <w:t xml:space="preserve"> Ing. María </w:t>
-      </w:r>
-      <w:proofErr w:type="spellStart"/>
-      <w:r>
-        <w:rPr>
-          <w:rFonts w:ascii="Arial" w:eastAsia="Arial" w:hAnsi="Arial" w:cs="Arial"/>
-          <w:b/>
-          <w:color w:val="000000"/>
-          <w:sz w:val="20"/>
-          <w:szCs w:val="20"/>
-        </w:rPr>
-        <w:t>Haydée</w:t>
-      </w:r>
-      <w:proofErr w:type="spellEnd"/>
-      <w:r>
-        <w:rPr>
-          <w:rFonts w:ascii="Arial" w:eastAsia="Arial" w:hAnsi="Arial" w:cs="Arial"/>
-          <w:b/>
-          <w:color w:val="000000"/>
-          <w:sz w:val="20"/>
-          <w:szCs w:val="20"/>
-        </w:rPr>
-        <w:t xml:space="preserve"> Peralta</w:t>
-      </w:r>
-      <w:r>
-        <w:rPr>
-          <w:rFonts w:ascii="Arial" w:eastAsia="Arial" w:hAnsi="Arial" w:cs="Arial"/>
-          <w:color w:val="000000"/>
-          <w:sz w:val="20"/>
-          <w:szCs w:val="20"/>
-        </w:rPr>
-        <w:t>, suscribe el presente en carácter de Decana de la Facultad de Ingeniería de la Universidad Nacional del Centro de la Provincia de Buenos Aires y en representación de la misma.-</w:t>
-      </w:r>
+        <w:t xml:space="preserve"> Ing. María Haydée Peralta</w:t>
+      </w:r>
+      <w:r>
+        <w:rPr>
+          <w:rFonts w:ascii="Arial" w:eastAsia="Arial" w:hAnsi="Arial" w:cs="Arial"/>
+          <w:color w:val="000000"/>
+          <w:sz w:val="20"/>
+          <w:szCs w:val="20"/>
+        </w:rPr>
+        <w:t xml:space="preserve">, suscribe el presente en carácter de Decana de la Facultad de Ingeniería de la Universidad Nacional del Centro de la Provincia de Buenos Aires y en representación de la </w:t>
+      </w:r>
+      <w:proofErr w:type="gramStart"/>
+      <w:r>
+        <w:rPr>
+          <w:rFonts w:ascii="Arial" w:eastAsia="Arial" w:hAnsi="Arial" w:cs="Arial"/>
+          <w:color w:val="000000"/>
+          <w:sz w:val="20"/>
+          <w:szCs w:val="20"/>
+        </w:rPr>
+        <w:t>misma.-</w:t>
+      </w:r>
+      <w:proofErr w:type="gramEnd"/>
     </w:p>
     <w:p>
       <w:pPr>
@@ -1742,7 +1853,6 @@
             <w:tcBorders>
               <w:top w:val="single" w:sz="4" w:space="0" w:color="000000"/>
             </w:tcBorders>
-            <w:shd w:val="clear" w:color="auto" w:fill="auto"/>
           </w:tcPr>
           <w:p>
             <w:pPr>
@@ -1859,7 +1969,6 @@
         <w:tc>
           <w:tcPr>
             <w:tcW w:w="3402" w:type="dxa"/>
-            <w:shd w:val="clear" w:color="auto" w:fill="auto"/>
           </w:tcPr>
           <w:p>
             <w:pPr>
@@ -1883,7 +1992,6 @@
             <w:tcBorders>
               <w:top w:val="single" w:sz="4" w:space="0" w:color="000000"/>
             </w:tcBorders>
-            <w:shd w:val="clear" w:color="auto" w:fill="auto"/>
           </w:tcPr>
           <w:p>
             <w:pPr>
@@ -1907,29 +2015,7 @@
                 <w:sz w:val="20"/>
                 <w:szCs w:val="20"/>
               </w:rPr>
-              <w:t xml:space="preserve">Mg. Ing. María </w:t>
-            </w:r>
-            <w:proofErr w:type="spellStart"/>
-            <w:r>
-              <w:rPr>
-                <w:rFonts w:ascii="Arial" w:eastAsia="Arial" w:hAnsi="Arial" w:cs="Arial"/>
-                <w:b/>
-                <w:color w:val="000000"/>
-                <w:sz w:val="20"/>
-                <w:szCs w:val="20"/>
-              </w:rPr>
-              <w:t>Haydée</w:t>
-            </w:r>
-            <w:proofErr w:type="spellEnd"/>
-            <w:r>
-              <w:rPr>
-                <w:rFonts w:ascii="Arial" w:eastAsia="Arial" w:hAnsi="Arial" w:cs="Arial"/>
-                <w:b/>
-                <w:color w:val="000000"/>
-                <w:sz w:val="20"/>
-                <w:szCs w:val="20"/>
-              </w:rPr>
-              <w:t xml:space="preserve"> Peralta</w:t>
+              <w:t>Mg. Ing. María Haydée Peralta</w:t>
             </w:r>
           </w:p>
           <w:p>
@@ -1980,7 +2066,6 @@
         <w:tc>
           <w:tcPr>
             <w:tcW w:w="3047" w:type="dxa"/>
-            <w:shd w:val="clear" w:color="auto" w:fill="auto"/>
           </w:tcPr>
           <w:p>
             <w:pPr>
@@ -2004,7 +2089,6 @@
             <w:tcBorders>
               <w:top w:val="single" w:sz="4" w:space="0" w:color="000000"/>
             </w:tcBorders>
-            <w:shd w:val="clear" w:color="auto" w:fill="auto"/>
           </w:tcPr>
           <w:p>
             <w:pPr>
@@ -2107,7 +2191,6 @@
         <w:tc>
           <w:tcPr>
             <w:tcW w:w="3046" w:type="dxa"/>
-            <w:shd w:val="clear" w:color="auto" w:fill="auto"/>
           </w:tcPr>
           <w:p>
             <w:pPr>
@@ -2151,7 +2234,7 @@
 </file>
 
 <file path=word/endnotes.xml><?xml version="1.0" encoding="utf-8"?>
-<w:endnotes xmlns:wpc="http://schemas.microsoft.com/office/word/2010/wordprocessingCanvas" xmlns:cx="http://schemas.microsoft.com/office/drawing/2014/chartex" xmlns:mc="http://schemas.openxmlformats.org/markup-compatibility/2006" xmlns:o="urn:schemas-microsoft-com:office:office" xmlns:r="http://schemas.openxmlformats.org/officeDocument/2006/relationships" xmlns:m="http://schemas.openxmlformats.org/officeDocument/2006/math" xmlns:v="urn:schemas-microsoft-com:vml" xmlns:wp14="http://schemas.microsoft.com/office/word/2010/wordprocessingDrawing" xmlns:wp="http://schemas.openxmlformats.org/drawingml/2006/wordprocessingDrawing" xmlns:w10="urn:schemas-microsoft-com:office:word" xmlns:w="http://schemas.openxmlformats.org/wordprocessingml/2006/main" xmlns:w14="http://schemas.microsoft.com/office/word/2010/wordml" xmlns:w15="http://schemas.microsoft.com/office/word/2012/wordml" xmlns:w16se="http://schemas.microsoft.com/office/word/2015/wordml/symex" xmlns:wpg="http://schemas.microsoft.com/office/word/2010/wordprocessingGroup" xmlns:wpi="http://schemas.microsoft.com/office/word/2010/wordprocessingInk" xmlns:wne="http://schemas.microsoft.com/office/word/2006/wordml" xmlns:wps="http://schemas.microsoft.com/office/word/2010/wordprocessingShape" mc:Ignorable="w14 w15 w16se wp14">
+<w:endnotes xmlns:wpc="http://schemas.microsoft.com/office/word/2010/wordprocessingCanvas" xmlns:cx="http://schemas.microsoft.com/office/drawing/2014/chartex" xmlns:cx1="http://schemas.microsoft.com/office/drawing/2015/9/8/chartex" xmlns:cx2="http://schemas.microsoft.com/office/drawing/2015/10/21/chartex" xmlns:cx3="http://schemas.microsoft.com/office/drawing/2016/5/9/chartex" xmlns:cx4="http://schemas.microsoft.com/office/drawing/2016/5/10/chartex" xmlns:cx5="http://schemas.microsoft.com/office/drawing/2016/5/11/chartex" xmlns:cx6="http://schemas.microsoft.com/office/drawing/2016/5/12/chartex" xmlns:cx7="http://schemas.microsoft.com/office/drawing/2016/5/13/chartex" xmlns:cx8="http://schemas.microsoft.com/office/drawing/2016/5/14/chartex" xmlns:mc="http://schemas.openxmlformats.org/markup-compatibility/2006" xmlns:aink="http://schemas.microsoft.com/office/drawing/2016/ink" xmlns:am3d="http://schemas.microsoft.com/office/drawing/2017/model3d" xmlns:o="urn:schemas-microsoft-com:office:office" xmlns:oel="http://schemas.microsoft.com/office/2019/extlst" xmlns:r="http://schemas.openxmlformats.org/officeDocument/2006/relationships" xmlns:m="http://schemas.openxmlformats.org/officeDocument/2006/math" xmlns:v="urn:schemas-microsoft-com:vml" xmlns:wp14="http://schemas.microsoft.com/office/word/2010/wordprocessingDrawing" xmlns:wp="http://schemas.openxmlformats.org/drawingml/2006/wordprocessingDrawing" xmlns:w10="urn:schemas-microsoft-com:office:word" xmlns:w="http://schemas.openxmlformats.org/wordprocessingml/2006/main" xmlns:w14="http://schemas.microsoft.com/office/word/2010/wordml" xmlns:w15="http://schemas.microsoft.com/office/word/2012/wordml" xmlns:w16cex="http://schemas.microsoft.com/office/word/2018/wordml/cex" xmlns:w16cid="http://schemas.microsoft.com/office/word/2016/wordml/cid" xmlns:w16="http://schemas.microsoft.com/office/word/2018/wordml" xmlns:w16du="http://schemas.microsoft.com/office/word/2023/wordml/word16du" xmlns:w16sdtdh="http://schemas.microsoft.com/office/word/2020/wordml/sdtdatahash" xmlns:w16sdtfl="http://schemas.microsoft.com/office/word/2024/wordml/sdtformatlock" xmlns:w16se="http://schemas.microsoft.com/office/word/2015/wordml/symex" xmlns:wpg="http://schemas.microsoft.com/office/word/2010/wordprocessingGroup" xmlns:wpi="http://schemas.microsoft.com/office/word/2010/wordprocessingInk" xmlns:wne="http://schemas.microsoft.com/office/word/2006/wordml" xmlns:wps="http://schemas.microsoft.com/office/word/2010/wordprocessingShape" mc:Ignorable="w14 w15 w16se w16cid w16 w16cex w16sdtdh w16sdtfl w16du wp14">
   <w:endnote w:type="separator" w:id="-1">
     <w:p>
       <w:pPr>
@@ -2178,7 +2261,7 @@
 </file>
 
 <file path=word/footnotes.xml><?xml version="1.0" encoding="utf-8"?>
-<w:footnotes xmlns:wpc="http://schemas.microsoft.com/office/word/2010/wordprocessingCanvas" xmlns:cx="http://schemas.microsoft.com/office/drawing/2014/chartex" xmlns:mc="http://schemas.openxmlformats.org/markup-compatibility/2006" xmlns:o="urn:schemas-microsoft-com:office:office" xmlns:r="http://schemas.openxmlformats.org/officeDocument/2006/relationships" xmlns:m="http://schemas.openxmlformats.org/officeDocument/2006/math" xmlns:v="urn:schemas-microsoft-com:vml" xmlns:wp14="http://schemas.microsoft.com/office/word/2010/wordprocessingDrawing" xmlns:wp="http://schemas.openxmlformats.org/drawingml/2006/wordprocessingDrawing" xmlns:w10="urn:schemas-microsoft-com:office:word" xmlns:w="http://schemas.openxmlformats.org/wordprocessingml/2006/main" xmlns:w14="http://schemas.microsoft.com/office/word/2010/wordml" xmlns:w15="http://schemas.microsoft.com/office/word/2012/wordml" xmlns:w16se="http://schemas.microsoft.com/office/word/2015/wordml/symex" xmlns:wpg="http://schemas.microsoft.com/office/word/2010/wordprocessingGroup" xmlns:wpi="http://schemas.microsoft.com/office/word/2010/wordprocessingInk" xmlns:wne="http://schemas.microsoft.com/office/word/2006/wordml" xmlns:wps="http://schemas.microsoft.com/office/word/2010/wordprocessingShape" mc:Ignorable="w14 w15 w16se wp14">
+<w:footnotes xmlns:wpc="http://schemas.microsoft.com/office/word/2010/wordprocessingCanvas" xmlns:cx="http://schemas.microsoft.com/office/drawing/2014/chartex" xmlns:cx1="http://schemas.microsoft.com/office/drawing/2015/9/8/chartex" xmlns:cx2="http://schemas.microsoft.com/office/drawing/2015/10/21/chartex" xmlns:cx3="http://schemas.microsoft.com/office/drawing/2016/5/9/chartex" xmlns:cx4="http://schemas.microsoft.com/office/drawing/2016/5/10/chartex" xmlns:cx5="http://schemas.microsoft.com/office/drawing/2016/5/11/chartex" xmlns:cx6="http://schemas.microsoft.com/office/drawing/2016/5/12/chartex" xmlns:cx7="http://schemas.microsoft.com/office/drawing/2016/5/13/chartex" xmlns:cx8="http://schemas.microsoft.com/office/drawing/2016/5/14/chartex" xmlns:mc="http://schemas.openxmlformats.org/markup-compatibility/2006" xmlns:aink="http://schemas.microsoft.com/office/drawing/2016/ink" xmlns:am3d="http://schemas.microsoft.com/office/drawing/2017/model3d" xmlns:o="urn:schemas-microsoft-com:office:office" xmlns:oel="http://schemas.microsoft.com/office/2019/extlst" xmlns:r="http://schemas.openxmlformats.org/officeDocument/2006/relationships" xmlns:m="http://schemas.openxmlformats.org/officeDocument/2006/math" xmlns:v="urn:schemas-microsoft-com:vml" xmlns:wp14="http://schemas.microsoft.com/office/word/2010/wordprocessingDrawing" xmlns:wp="http://schemas.openxmlformats.org/drawingml/2006/wordprocessingDrawing" xmlns:w10="urn:schemas-microsoft-com:office:word" xmlns:w="http://schemas.openxmlformats.org/wordprocessingml/2006/main" xmlns:w14="http://schemas.microsoft.com/office/word/2010/wordml" xmlns:w15="http://schemas.microsoft.com/office/word/2012/wordml" xmlns:w16cex="http://schemas.microsoft.com/office/word/2018/wordml/cex" xmlns:w16cid="http://schemas.microsoft.com/office/word/2016/wordml/cid" xmlns:w16="http://schemas.microsoft.com/office/word/2018/wordml" xmlns:w16du="http://schemas.microsoft.com/office/word/2023/wordml/word16du" xmlns:w16sdtdh="http://schemas.microsoft.com/office/word/2020/wordml/sdtdatahash" xmlns:w16sdtfl="http://schemas.microsoft.com/office/word/2024/wordml/sdtformatlock" xmlns:w16se="http://schemas.microsoft.com/office/word/2015/wordml/symex" xmlns:wpg="http://schemas.microsoft.com/office/word/2010/wordprocessingGroup" xmlns:wpi="http://schemas.microsoft.com/office/word/2010/wordprocessingInk" xmlns:wne="http://schemas.microsoft.com/office/word/2006/wordml" xmlns:wps="http://schemas.microsoft.com/office/word/2010/wordprocessingShape" mc:Ignorable="w14 w15 w16se w16cid w16 w16cex w16sdtdh w16sdtfl w16du wp14">
   <w:footnote w:type="separator" w:id="-1">
     <w:p>
       <w:pPr>
@@ -2205,7 +2288,7 @@
 </file>
 
 <file path=word/header1.xml><?xml version="1.0" encoding="utf-8"?>
-<w:hdr xmlns:wpc="http://schemas.microsoft.com/office/word/2010/wordprocessingCanvas" xmlns:cx="http://schemas.microsoft.com/office/drawing/2014/chartex" xmlns:mc="http://schemas.openxmlformats.org/markup-compatibility/2006" xmlns:o="urn:schemas-microsoft-com:office:office" xmlns:r="http://schemas.openxmlformats.org/officeDocument/2006/relationships" xmlns:m="http://schemas.openxmlformats.org/officeDocument/2006/math" xmlns:v="urn:schemas-microsoft-com:vml" xmlns:wp14="http://schemas.microsoft.com/office/word/2010/wordprocessingDrawing" xmlns:wp="http://schemas.openxmlformats.org/drawingml/2006/wordprocessingDrawing" xmlns:w10="urn:schemas-microsoft-com:office:word" xmlns:w="http://schemas.openxmlformats.org/wordprocessingml/2006/main" xmlns:w14="http://schemas.microsoft.com/office/word/2010/wordml" xmlns:w15="http://schemas.microsoft.com/office/word/2012/wordml" xmlns:w16se="http://schemas.microsoft.com/office/word/2015/wordml/symex" xmlns:wpg="http://schemas.microsoft.com/office/word/2010/wordprocessingGroup" xmlns:wpi="http://schemas.microsoft.com/office/word/2010/wordprocessingInk" xmlns:wne="http://schemas.microsoft.com/office/word/2006/wordml" xmlns:wps="http://schemas.microsoft.com/office/word/2010/wordprocessingShape" mc:Ignorable="w14 w15 w16se wp14">
+<w:hdr xmlns:wpc="http://schemas.microsoft.com/office/word/2010/wordprocessingCanvas" xmlns:cx="http://schemas.microsoft.com/office/drawing/2014/chartex" xmlns:cx1="http://schemas.microsoft.com/office/drawing/2015/9/8/chartex" xmlns:cx2="http://schemas.microsoft.com/office/drawing/2015/10/21/chartex" xmlns:cx3="http://schemas.microsoft.com/office/drawing/2016/5/9/chartex" xmlns:cx4="http://schemas.microsoft.com/office/drawing/2016/5/10/chartex" xmlns:cx5="http://schemas.microsoft.com/office/drawing/2016/5/11/chartex" xmlns:cx6="http://schemas.microsoft.com/office/drawing/2016/5/12/chartex" xmlns:cx7="http://schemas.microsoft.com/office/drawing/2016/5/13/chartex" xmlns:cx8="http://schemas.microsoft.com/office/drawing/2016/5/14/chartex" xmlns:mc="http://schemas.openxmlformats.org/markup-compatibility/2006" xmlns:aink="http://schemas.microsoft.com/office/drawing/2016/ink" xmlns:am3d="http://schemas.microsoft.com/office/drawing/2017/model3d" xmlns:o="urn:schemas-microsoft-com:office:office" xmlns:oel="http://schemas.microsoft.com/office/2019/extlst" xmlns:r="http://schemas.openxmlformats.org/officeDocument/2006/relationships" xmlns:m="http://schemas.openxmlformats.org/officeDocument/2006/math" xmlns:v="urn:schemas-microsoft-com:vml" xmlns:wp14="http://schemas.microsoft.com/office/word/2010/wordprocessingDrawing" xmlns:wp="http://schemas.openxmlformats.org/drawingml/2006/wordprocessingDrawing" xmlns:w10="urn:schemas-microsoft-com:office:word" xmlns:w="http://schemas.openxmlformats.org/wordprocessingml/2006/main" xmlns:w14="http://schemas.microsoft.com/office/word/2010/wordml" xmlns:w15="http://schemas.microsoft.com/office/word/2012/wordml" xmlns:w16cex="http://schemas.microsoft.com/office/word/2018/wordml/cex" xmlns:w16cid="http://schemas.microsoft.com/office/word/2016/wordml/cid" xmlns:w16="http://schemas.microsoft.com/office/word/2018/wordml" xmlns:w16du="http://schemas.microsoft.com/office/word/2023/wordml/word16du" xmlns:w16sdtdh="http://schemas.microsoft.com/office/word/2020/wordml/sdtdatahash" xmlns:w16sdtfl="http://schemas.microsoft.com/office/word/2024/wordml/sdtformatlock" xmlns:w16se="http://schemas.microsoft.com/office/word/2015/wordml/symex" xmlns:wpg="http://schemas.microsoft.com/office/word/2010/wordprocessingGroup" xmlns:wpi="http://schemas.microsoft.com/office/word/2010/wordprocessingInk" xmlns:wne="http://schemas.microsoft.com/office/word/2006/wordml" xmlns:wps="http://schemas.microsoft.com/office/word/2010/wordprocessingShape" mc:Ignorable="w14 w15 w16se w16cid w16 w16cex w16sdtdh w16sdtfl w16du wp14">
   <w:p>
     <w:pPr>
       <w:pBdr>
@@ -2228,7 +2311,7 @@
         <w:lang w:val="en-US" w:eastAsia="en-US"/>
       </w:rPr>
       <w:drawing>
-        <wp:inline distT="0" distB="0" distL="114300" distR="114300">
+        <wp:inline distT="0" distB="0" distL="114300" distR="114300" wp14:anchorId="7037E236" wp14:editId="2AEE29A7">
           <wp:extent cx="5763895" cy="654685"/>
           <wp:effectExtent l="0" t="0" r="0" b="0"/>
           <wp:docPr id="1026" name="image1.jpg"/>
@@ -2284,7 +2367,7 @@
 </file>
 
 <file path=word/header2.xml><?xml version="1.0" encoding="utf-8"?>
-<w:hdr xmlns:wpc="http://schemas.microsoft.com/office/word/2010/wordprocessingCanvas" xmlns:cx="http://schemas.microsoft.com/office/drawing/2014/chartex" xmlns:mc="http://schemas.openxmlformats.org/markup-compatibility/2006" xmlns:o="urn:schemas-microsoft-com:office:office" xmlns:r="http://schemas.openxmlformats.org/officeDocument/2006/relationships" xmlns:m="http://schemas.openxmlformats.org/officeDocument/2006/math" xmlns:v="urn:schemas-microsoft-com:vml" xmlns:wp14="http://schemas.microsoft.com/office/word/2010/wordprocessingDrawing" xmlns:wp="http://schemas.openxmlformats.org/drawingml/2006/wordprocessingDrawing" xmlns:w10="urn:schemas-microsoft-com:office:word" xmlns:w="http://schemas.openxmlformats.org/wordprocessingml/2006/main" xmlns:w14="http://schemas.microsoft.com/office/word/2010/wordml" xmlns:w15="http://schemas.microsoft.com/office/word/2012/wordml" xmlns:w16se="http://schemas.microsoft.com/office/word/2015/wordml/symex" xmlns:wpg="http://schemas.microsoft.com/office/word/2010/wordprocessingGroup" xmlns:wpi="http://schemas.microsoft.com/office/word/2010/wordprocessingInk" xmlns:wne="http://schemas.microsoft.com/office/word/2006/wordml" xmlns:wps="http://schemas.microsoft.com/office/word/2010/wordprocessingShape" mc:Ignorable="w14 w15 w16se wp14">
+<w:hdr xmlns:wpc="http://schemas.microsoft.com/office/word/2010/wordprocessingCanvas" xmlns:cx="http://schemas.microsoft.com/office/drawing/2014/chartex" xmlns:cx1="http://schemas.microsoft.com/office/drawing/2015/9/8/chartex" xmlns:cx2="http://schemas.microsoft.com/office/drawing/2015/10/21/chartex" xmlns:cx3="http://schemas.microsoft.com/office/drawing/2016/5/9/chartex" xmlns:cx4="http://schemas.microsoft.com/office/drawing/2016/5/10/chartex" xmlns:cx5="http://schemas.microsoft.com/office/drawing/2016/5/11/chartex" xmlns:cx6="http://schemas.microsoft.com/office/drawing/2016/5/12/chartex" xmlns:cx7="http://schemas.microsoft.com/office/drawing/2016/5/13/chartex" xmlns:cx8="http://schemas.microsoft.com/office/drawing/2016/5/14/chartex" xmlns:mc="http://schemas.openxmlformats.org/markup-compatibility/2006" xmlns:aink="http://schemas.microsoft.com/office/drawing/2016/ink" xmlns:am3d="http://schemas.microsoft.com/office/drawing/2017/model3d" xmlns:o="urn:schemas-microsoft-com:office:office" xmlns:oel="http://schemas.microsoft.com/office/2019/extlst" xmlns:r="http://schemas.openxmlformats.org/officeDocument/2006/relationships" xmlns:m="http://schemas.openxmlformats.org/officeDocument/2006/math" xmlns:v="urn:schemas-microsoft-com:vml" xmlns:wp14="http://schemas.microsoft.com/office/word/2010/wordprocessingDrawing" xmlns:wp="http://schemas.openxmlformats.org/drawingml/2006/wordprocessingDrawing" xmlns:w10="urn:schemas-microsoft-com:office:word" xmlns:w="http://schemas.openxmlformats.org/wordprocessingml/2006/main" xmlns:w14="http://schemas.microsoft.com/office/word/2010/wordml" xmlns:w15="http://schemas.microsoft.com/office/word/2012/wordml" xmlns:w16cex="http://schemas.microsoft.com/office/word/2018/wordml/cex" xmlns:w16cid="http://schemas.microsoft.com/office/word/2016/wordml/cid" xmlns:w16="http://schemas.microsoft.com/office/word/2018/wordml" xmlns:w16du="http://schemas.microsoft.com/office/word/2023/wordml/word16du" xmlns:w16sdtdh="http://schemas.microsoft.com/office/word/2020/wordml/sdtdatahash" xmlns:w16sdtfl="http://schemas.microsoft.com/office/word/2024/wordml/sdtformatlock" xmlns:w16se="http://schemas.microsoft.com/office/word/2015/wordml/symex" xmlns:wpg="http://schemas.microsoft.com/office/word/2010/wordprocessingGroup" xmlns:wpi="http://schemas.microsoft.com/office/word/2010/wordprocessingInk" xmlns:wne="http://schemas.microsoft.com/office/word/2006/wordml" xmlns:wps="http://schemas.microsoft.com/office/word/2010/wordprocessingShape" mc:Ignorable="w14 w15 w16se w16cid w16 w16cex w16sdtdh w16sdtfl w16du wp14">
   <w:p>
     <w:pPr>
       <w:ind w:left="0" w:hanging="2"/>
@@ -2294,7 +2377,7 @@
 </file>
 
 <file path=word/numbering.xml><?xml version="1.0" encoding="utf-8"?>
-<w:numbering xmlns:wpc="http://schemas.microsoft.com/office/word/2010/wordprocessingCanvas" xmlns:cx="http://schemas.microsoft.com/office/drawing/2014/chartex" xmlns:mc="http://schemas.openxmlformats.org/markup-compatibility/2006" xmlns:o="urn:schemas-microsoft-com:office:office" xmlns:r="http://schemas.openxmlformats.org/officeDocument/2006/relationships" xmlns:m="http://schemas.openxmlformats.org/officeDocument/2006/math" xmlns:v="urn:schemas-microsoft-com:vml" xmlns:wp14="http://schemas.microsoft.com/office/word/2010/wordprocessingDrawing" xmlns:wp="http://schemas.openxmlformats.org/drawingml/2006/wordprocessingDrawing" xmlns:w10="urn:schemas-microsoft-com:office:word" xmlns:w="http://schemas.openxmlformats.org/wordprocessingml/2006/main" xmlns:w14="http://schemas.microsoft.com/office/word/2010/wordml" xmlns:w15="http://schemas.microsoft.com/office/word/2012/wordml" xmlns:w16se="http://schemas.microsoft.com/office/word/2015/wordml/symex" xmlns:wpg="http://schemas.microsoft.com/office/word/2010/wordprocessingGroup" xmlns:wpi="http://schemas.microsoft.com/office/word/2010/wordprocessingInk" xmlns:wne="http://schemas.microsoft.com/office/word/2006/wordml" xmlns:wps="http://schemas.microsoft.com/office/word/2010/wordprocessingShape" mc:Ignorable="w14 w15 w16se wp14">
+<w:numbering xmlns:wpc="http://schemas.microsoft.com/office/word/2010/wordprocessingCanvas" xmlns:cx="http://schemas.microsoft.com/office/drawing/2014/chartex" xmlns:cx1="http://schemas.microsoft.com/office/drawing/2015/9/8/chartex" xmlns:cx2="http://schemas.microsoft.com/office/drawing/2015/10/21/chartex" xmlns:cx3="http://schemas.microsoft.com/office/drawing/2016/5/9/chartex" xmlns:cx4="http://schemas.microsoft.com/office/drawing/2016/5/10/chartex" xmlns:cx5="http://schemas.microsoft.com/office/drawing/2016/5/11/chartex" xmlns:cx6="http://schemas.microsoft.com/office/drawing/2016/5/12/chartex" xmlns:cx7="http://schemas.microsoft.com/office/drawing/2016/5/13/chartex" xmlns:cx8="http://schemas.microsoft.com/office/drawing/2016/5/14/chartex" xmlns:mc="http://schemas.openxmlformats.org/markup-compatibility/2006" xmlns:aink="http://schemas.microsoft.com/office/drawing/2016/ink" xmlns:am3d="http://schemas.microsoft.com/office/drawing/2017/model3d" xmlns:o="urn:schemas-microsoft-com:office:office" xmlns:oel="http://schemas.microsoft.com/office/2019/extlst" xmlns:r="http://schemas.openxmlformats.org/officeDocument/2006/relationships" xmlns:m="http://schemas.openxmlformats.org/officeDocument/2006/math" xmlns:v="urn:schemas-microsoft-com:vml" xmlns:wp14="http://schemas.microsoft.com/office/word/2010/wordprocessingDrawing" xmlns:wp="http://schemas.openxmlformats.org/drawingml/2006/wordprocessingDrawing" xmlns:w10="urn:schemas-microsoft-com:office:word" xmlns:w="http://schemas.openxmlformats.org/wordprocessingml/2006/main" xmlns:w14="http://schemas.microsoft.com/office/word/2010/wordml" xmlns:w15="http://schemas.microsoft.com/office/word/2012/wordml" xmlns:w16cex="http://schemas.microsoft.com/office/word/2018/wordml/cex" xmlns:w16cid="http://schemas.microsoft.com/office/word/2016/wordml/cid" xmlns:w16="http://schemas.microsoft.com/office/word/2018/wordml" xmlns:w16du="http://schemas.microsoft.com/office/word/2023/wordml/word16du" xmlns:w16sdtdh="http://schemas.microsoft.com/office/word/2020/wordml/sdtdatahash" xmlns:w16sdtfl="http://schemas.microsoft.com/office/word/2024/wordml/sdtformatlock" xmlns:w16se="http://schemas.microsoft.com/office/word/2015/wordml/symex" xmlns:wpg="http://schemas.microsoft.com/office/word/2010/wordprocessingGroup" xmlns:wpi="http://schemas.microsoft.com/office/word/2010/wordprocessingInk" xmlns:wne="http://schemas.microsoft.com/office/word/2006/wordml" xmlns:wps="http://schemas.microsoft.com/office/word/2010/wordprocessingShape" mc:Ignorable="w14 w15 w16se w16cid w16 w16cex w16sdtdh w16sdtfl w16du wp14">
   <w:abstractNum w:abstractNumId="0" w15:restartNumberingAfterBreak="0">
     <w:nsid w:val="260F4420"/>
     <w:multiLevelType w:val="multilevel"/>
@@ -2412,14 +2495,14 @@
       </w:rPr>
     </w:lvl>
   </w:abstractNum>
-  <w:num w:numId="1">
+  <w:num w:numId="1" w16cid:durableId="172034796">
     <w:abstractNumId w:val="0"/>
   </w:num>
 </w:numbering>
 </file>
 
 <file path=word/styles.xml><?xml version="1.0" encoding="utf-8"?>
-<w:styles xmlns:mc="http://schemas.openxmlformats.org/markup-compatibility/2006" xmlns:r="http://schemas.openxmlformats.org/officeDocument/2006/relationships" xmlns:w="http://schemas.openxmlformats.org/wordprocessingml/2006/main" xmlns:w14="http://schemas.microsoft.com/office/word/2010/wordml" xmlns:w15="http://schemas.microsoft.com/office/word/2012/wordml" xmlns:w16se="http://schemas.microsoft.com/office/word/2015/wordml/symex" mc:Ignorable="w14 w15 w16se">
+<w:styles xmlns:mc="http://schemas.openxmlformats.org/markup-compatibility/2006" xmlns:r="http://schemas.openxmlformats.org/officeDocument/2006/relationships" xmlns:w="http://schemas.openxmlformats.org/wordprocessingml/2006/main" xmlns:w14="http://schemas.microsoft.com/office/word/2010/wordml" xmlns:w15="http://schemas.microsoft.com/office/word/2012/wordml" xmlns:w16cex="http://schemas.microsoft.com/office/word/2018/wordml/cex" xmlns:w16cid="http://schemas.microsoft.com/office/word/2016/wordml/cid" xmlns:w16="http://schemas.microsoft.com/office/word/2018/wordml" xmlns:w16du="http://schemas.microsoft.com/office/word/2023/wordml/word16du" xmlns:w16sdtdh="http://schemas.microsoft.com/office/word/2020/wordml/sdtdatahash" xmlns:w16sdtfl="http://schemas.microsoft.com/office/word/2024/wordml/sdtformatlock" xmlns:w16se="http://schemas.microsoft.com/office/word/2015/wordml/symex" mc:Ignorable="w14 w15 w16se w16cid w16 w16cex w16sdtdh w16sdtfl w16du">
   <w:docDefaults>
     <w:rPrDefault>
       <w:rPr>
@@ -2431,7 +2514,7 @@
     </w:rPrDefault>
     <w:pPrDefault/>
   </w:docDefaults>
-  <w:latentStyles w:defLockedState="0" w:defUIPriority="99" w:defSemiHidden="0" w:defUnhideWhenUsed="0" w:defQFormat="0" w:count="371">
+  <w:latentStyles w:defLockedState="0" w:defUIPriority="99" w:defSemiHidden="0" w:defUnhideWhenUsed="0" w:defQFormat="0" w:count="376">
     <w:lsdException w:name="Normal" w:uiPriority="0" w:qFormat="1"/>
     <w:lsdException w:name="heading 1" w:uiPriority="9" w:qFormat="1"/>
     <w:lsdException w:name="heading 2" w:semiHidden="1" w:uiPriority="9" w:unhideWhenUsed="1" w:qFormat="1"/>
@@ -2803,6 +2886,11 @@
     <w:lsdException w:name="List Table 5 Dark Accent 6" w:uiPriority="50"/>
     <w:lsdException w:name="List Table 6 Colorful Accent 6" w:uiPriority="51"/>
     <w:lsdException w:name="List Table 7 Colorful Accent 6" w:uiPriority="52"/>
+    <w:lsdException w:name="Mention" w:semiHidden="1" w:unhideWhenUsed="1"/>
+    <w:lsdException w:name="Smart Hyperlink" w:semiHidden="1" w:unhideWhenUsed="1"/>
+    <w:lsdException w:name="Hashtag" w:semiHidden="1" w:unhideWhenUsed="1"/>
+    <w:lsdException w:name="Unresolved Mention" w:semiHidden="1" w:unhideWhenUsed="1"/>
+    <w:lsdException w:name="Smart Link" w:semiHidden="1" w:unhideWhenUsed="1"/>
   </w:latentStyles>
   <w:style w:type="paragraph" w:default="1" w:styleId="Normal">
     <w:name w:val="Normal"/>

</xml_diff>